<commit_message>
First commit after adding roads model Julia code + draft
</commit_message>
<xml_diff>
--- a/ohio_taxation/docs/JMP_draft/JMP_extended_abstract.docx
+++ b/ohio_taxation/docs/JMP_draft/JMP_extended_abstract.docx
@@ -51,7 +51,39 @@
           <w:sz w:val="24"/>
           <w:szCs w:val="24"/>
         </w:rPr>
-        <w:t xml:space="preserve"> local public good: they depreciate continually, are experienced daily by residents, and are financed mainly from local taxes</w:t>
+        <w:t xml:space="preserve"> local public good: they depreciate continually, are experienced daily by residents, and are financed mainly </w:t>
+      </w:r>
+      <w:r>
+        <w:rPr>
+          <w:rFonts w:ascii="Times New Roman" w:eastAsia="Times New Roman" w:hAnsi="Times New Roman" w:cs="Times New Roman"/>
+          <w:sz w:val="24"/>
+          <w:szCs w:val="24"/>
+        </w:rPr>
+        <w:t>via</w:t>
+      </w:r>
+      <w:r>
+        <w:rPr>
+          <w:rFonts w:ascii="Times New Roman" w:eastAsia="Times New Roman" w:hAnsi="Times New Roman" w:cs="Times New Roman"/>
+          <w:sz w:val="24"/>
+          <w:szCs w:val="24"/>
+        </w:rPr>
+        <w:t xml:space="preserve"> local </w:t>
+      </w:r>
+      <w:r>
+        <w:rPr>
+          <w:rFonts w:ascii="Times New Roman" w:eastAsia="Times New Roman" w:hAnsi="Times New Roman" w:cs="Times New Roman"/>
+          <w:sz w:val="24"/>
+          <w:szCs w:val="24"/>
+        </w:rPr>
+        <w:t xml:space="preserve">property </w:t>
+      </w:r>
+      <w:r>
+        <w:rPr>
+          <w:rFonts w:ascii="Times New Roman" w:eastAsia="Times New Roman" w:hAnsi="Times New Roman" w:cs="Times New Roman"/>
+          <w:sz w:val="24"/>
+          <w:szCs w:val="24"/>
+        </w:rPr>
+        <w:t>taxes</w:t>
       </w:r>
       <w:r>
         <w:rPr>
@@ -157,7 +189,25 @@
           <w:sz w:val="24"/>
           <w:szCs w:val="24"/>
         </w:rPr>
-        <w:t xml:space="preserve"> available to explain the importance of existing </w:t>
+        <w:t xml:space="preserve"> available to explain the importance of </w:t>
+      </w:r>
+      <w:r>
+        <w:rPr>
+          <w:rFonts w:ascii="Times New Roman" w:eastAsia="Times New Roman" w:hAnsi="Times New Roman" w:cs="Times New Roman"/>
+          <w:i/>
+          <w:iCs/>
+          <w:sz w:val="24"/>
+          <w:szCs w:val="24"/>
+        </w:rPr>
+        <w:t>existing</w:t>
+      </w:r>
+      <w:r>
+        <w:rPr>
+          <w:rFonts w:ascii="Times New Roman" w:eastAsia="Times New Roman" w:hAnsi="Times New Roman" w:cs="Times New Roman"/>
+          <w:sz w:val="24"/>
+          <w:szCs w:val="24"/>
+        </w:rPr>
+        <w:t xml:space="preserve"> </w:t>
       </w:r>
       <w:r>
         <w:rPr>
@@ -366,7 +416,23 @@
           <w:szCs w:val="24"/>
         </w:rPr>
         <w:br/>
-        <w:t xml:space="preserve">We assemble a novel panel of 617 </w:t>
+        <w:t xml:space="preserve">We assemble a novel panel </w:t>
+      </w:r>
+      <w:r>
+        <w:rPr>
+          <w:rFonts w:ascii="Times New Roman" w:eastAsia="Times New Roman" w:hAnsi="Times New Roman" w:cs="Times New Roman"/>
+          <w:sz w:val="24"/>
+          <w:szCs w:val="24"/>
+        </w:rPr>
+        <w:t xml:space="preserve">comprising </w:t>
+      </w:r>
+      <w:r>
+        <w:rPr>
+          <w:rFonts w:ascii="Times New Roman" w:eastAsia="Times New Roman" w:hAnsi="Times New Roman" w:cs="Times New Roman"/>
+          <w:sz w:val="24"/>
+          <w:szCs w:val="24"/>
+        </w:rPr>
+        <w:t xml:space="preserve">of </w:t>
       </w:r>
       <w:r>
         <w:rPr>
@@ -442,15 +508,7 @@
           <w:sz w:val="24"/>
           <w:szCs w:val="24"/>
         </w:rPr>
-        <w:t>3 184</w:t>
-      </w:r>
-      <w:r>
-        <w:rPr>
-          <w:rFonts w:ascii="Times New Roman" w:eastAsia="Times New Roman" w:hAnsi="Times New Roman" w:cs="Times New Roman"/>
-          <w:sz w:val="24"/>
-          <w:szCs w:val="24"/>
-        </w:rPr>
-        <w:t xml:space="preserve"> renewal votes held between 1991-2021 in </w:t>
+        <w:t>3</w:t>
       </w:r>
       <w:r>
         <w:rPr>
@@ -460,6 +518,34 @@
           <w:sz w:val="24"/>
           <w:szCs w:val="24"/>
         </w:rPr>
+        <w:t>,</w:t>
+      </w:r>
+      <w:r>
+        <w:rPr>
+          <w:rFonts w:ascii="Times New Roman" w:eastAsia="Times New Roman" w:hAnsi="Times New Roman" w:cs="Times New Roman"/>
+          <w:b/>
+          <w:bCs/>
+          <w:sz w:val="24"/>
+          <w:szCs w:val="24"/>
+        </w:rPr>
+        <w:t>184</w:t>
+      </w:r>
+      <w:r>
+        <w:rPr>
+          <w:rFonts w:ascii="Times New Roman" w:eastAsia="Times New Roman" w:hAnsi="Times New Roman" w:cs="Times New Roman"/>
+          <w:sz w:val="24"/>
+          <w:szCs w:val="24"/>
+        </w:rPr>
+        <w:t xml:space="preserve"> renewal votes held between 1991-2021 in </w:t>
+      </w:r>
+      <w:r>
+        <w:rPr>
+          <w:rFonts w:ascii="Times New Roman" w:eastAsia="Times New Roman" w:hAnsi="Times New Roman" w:cs="Times New Roman"/>
+          <w:b/>
+          <w:bCs/>
+          <w:sz w:val="24"/>
+          <w:szCs w:val="24"/>
+        </w:rPr>
         <w:t>617</w:t>
       </w:r>
       <w:r>
@@ -516,15 +602,39 @@
           <w:sz w:val="24"/>
           <w:szCs w:val="24"/>
         </w:rPr>
-        <w:t xml:space="preserve">estimate </w:t>
-      </w:r>
-      <w:r>
-        <w:rPr>
-          <w:rFonts w:ascii="Times New Roman" w:eastAsia="Times New Roman" w:hAnsi="Times New Roman" w:cs="Times New Roman"/>
-          <w:sz w:val="24"/>
-          <w:szCs w:val="24"/>
-        </w:rPr>
-        <w:t xml:space="preserve">the dollar loss each city suffers if the levy fails (mean loss </w:t>
+        <w:t>compute</w:t>
+      </w:r>
+      <w:r>
+        <w:rPr>
+          <w:rFonts w:ascii="Times New Roman" w:eastAsia="Times New Roman" w:hAnsi="Times New Roman" w:cs="Times New Roman"/>
+          <w:sz w:val="24"/>
+          <w:szCs w:val="24"/>
+        </w:rPr>
+        <w:t xml:space="preserve"> </w:t>
+      </w:r>
+      <w:r>
+        <w:rPr>
+          <w:rFonts w:ascii="Times New Roman" w:eastAsia="Times New Roman" w:hAnsi="Times New Roman" w:cs="Times New Roman"/>
+          <w:sz w:val="24"/>
+          <w:szCs w:val="24"/>
+        </w:rPr>
+        <w:t xml:space="preserve">the </w:t>
+      </w:r>
+      <w:r>
+        <w:rPr>
+          <w:rFonts w:ascii="Times New Roman" w:eastAsia="Times New Roman" w:hAnsi="Times New Roman" w:cs="Times New Roman"/>
+          <w:sz w:val="24"/>
+          <w:szCs w:val="24"/>
+        </w:rPr>
+        <w:t xml:space="preserve">expected </w:t>
+      </w:r>
+      <w:r>
+        <w:rPr>
+          <w:rFonts w:ascii="Times New Roman" w:eastAsia="Times New Roman" w:hAnsi="Times New Roman" w:cs="Times New Roman"/>
+          <w:sz w:val="24"/>
+          <w:szCs w:val="24"/>
+        </w:rPr>
+        <w:t xml:space="preserve">dollar loss each city suffers if the levy fails (mean loss </w:t>
       </w:r>
       <w:r>
         <w:rPr>
@@ -704,7 +814,23 @@
           <w:sz w:val="24"/>
           <w:szCs w:val="24"/>
         </w:rPr>
-        <w:t xml:space="preserve"> – To </w:t>
+        <w:t xml:space="preserve"> – </w:t>
+      </w:r>
+      <w:r>
+        <w:rPr>
+          <w:rFonts w:ascii="Times New Roman" w:eastAsia="Times New Roman" w:hAnsi="Times New Roman" w:cs="Times New Roman"/>
+          <w:sz w:val="24"/>
+          <w:szCs w:val="24"/>
+        </w:rPr>
+        <w:t>We</w:t>
+      </w:r>
+      <w:r>
+        <w:rPr>
+          <w:rFonts w:ascii="Times New Roman" w:eastAsia="Times New Roman" w:hAnsi="Times New Roman" w:cs="Times New Roman"/>
+          <w:sz w:val="24"/>
+          <w:szCs w:val="24"/>
+        </w:rPr>
+        <w:t xml:space="preserve"> </w:t>
       </w:r>
       <w:r>
         <w:rPr>
@@ -740,7 +866,23 @@
           <w:sz w:val="24"/>
           <w:szCs w:val="24"/>
         </w:rPr>
-        <w:t>, we do the following</w:t>
+        <w:t xml:space="preserve">, </w:t>
+      </w:r>
+      <w:r>
+        <w:rPr>
+          <w:rFonts w:ascii="Times New Roman" w:eastAsia="Times New Roman" w:hAnsi="Times New Roman" w:cs="Times New Roman"/>
+          <w:sz w:val="24"/>
+          <w:szCs w:val="24"/>
+        </w:rPr>
+        <w:t xml:space="preserve">by utilizing </w:t>
+      </w:r>
+      <w:r>
+        <w:rPr>
+          <w:rFonts w:ascii="Times New Roman" w:eastAsia="Times New Roman" w:hAnsi="Times New Roman" w:cs="Times New Roman"/>
+          <w:sz w:val="24"/>
+          <w:szCs w:val="24"/>
+        </w:rPr>
+        <w:t>the following</w:t>
       </w:r>
       <w:r>
         <w:rPr>
@@ -812,7 +954,55 @@
           <w:sz w:val="24"/>
           <w:szCs w:val="24"/>
         </w:rPr>
-        <w:t>677 labeled satellite tiles from Brewer et al. (2021) (classes: poor | decent | good).</w:t>
+        <w:t xml:space="preserve">677 labeled satellite tiles from Brewer et al. (2021) (classes: </w:t>
+      </w:r>
+      <w:r>
+        <w:rPr>
+          <w:rFonts w:ascii="Times New Roman" w:eastAsia="Times New Roman" w:hAnsi="Times New Roman" w:cs="Times New Roman"/>
+          <w:sz w:val="24"/>
+          <w:szCs w:val="24"/>
+        </w:rPr>
+        <w:t>low</w:t>
+      </w:r>
+      <w:r>
+        <w:rPr>
+          <w:rFonts w:ascii="Times New Roman" w:eastAsia="Times New Roman" w:hAnsi="Times New Roman" w:cs="Times New Roman"/>
+          <w:sz w:val="24"/>
+          <w:szCs w:val="24"/>
+        </w:rPr>
+        <w:t xml:space="preserve"> | </w:t>
+      </w:r>
+      <w:r>
+        <w:rPr>
+          <w:rFonts w:ascii="Times New Roman" w:eastAsia="Times New Roman" w:hAnsi="Times New Roman" w:cs="Times New Roman"/>
+          <w:sz w:val="24"/>
+          <w:szCs w:val="24"/>
+        </w:rPr>
+        <w:t>medium</w:t>
+      </w:r>
+      <w:r>
+        <w:rPr>
+          <w:rFonts w:ascii="Times New Roman" w:eastAsia="Times New Roman" w:hAnsi="Times New Roman" w:cs="Times New Roman"/>
+          <w:sz w:val="24"/>
+          <w:szCs w:val="24"/>
+        </w:rPr>
+        <w:t xml:space="preserve"> | </w:t>
+      </w:r>
+      <w:r>
+        <w:rPr>
+          <w:rFonts w:ascii="Times New Roman" w:eastAsia="Times New Roman" w:hAnsi="Times New Roman" w:cs="Times New Roman"/>
+          <w:sz w:val="24"/>
+          <w:szCs w:val="24"/>
+        </w:rPr>
+        <w:t>high</w:t>
+      </w:r>
+      <w:r>
+        <w:rPr>
+          <w:rFonts w:ascii="Times New Roman" w:eastAsia="Times New Roman" w:hAnsi="Times New Roman" w:cs="Times New Roman"/>
+          <w:sz w:val="24"/>
+          <w:szCs w:val="24"/>
+        </w:rPr>
+        <w:t>)</w:t>
       </w:r>
     </w:p>
     <w:p>
@@ -938,7 +1128,7 @@
           <w:sz w:val="24"/>
           <w:szCs w:val="24"/>
         </w:rPr>
-        <w:t xml:space="preserve"> – Using Google Earth Engine, we extract pre- &amp; post-</w:t>
+        <w:t xml:space="preserve"> – Using Google Earth, we extract pre- &amp; post-</w:t>
       </w:r>
       <w:r>
         <w:rPr>
@@ -1004,15 +1194,103 @@
           <w:sz w:val="24"/>
           <w:szCs w:val="24"/>
         </w:rPr>
-        <w:t xml:space="preserve"> a 0-to-2 score</w:t>
-      </w:r>
-      <w:r>
-        <w:rPr>
-          <w:rFonts w:ascii="Times New Roman" w:eastAsia="Times New Roman" w:hAnsi="Times New Roman" w:cs="Times New Roman"/>
-          <w:sz w:val="24"/>
-          <w:szCs w:val="24"/>
-        </w:rPr>
-        <w:t xml:space="preserve"> which we use to determine road quality</w:t>
+        <w:t xml:space="preserve"> a </w:t>
+      </w:r>
+      <w:r>
+        <w:rPr>
+          <w:rFonts w:ascii="Times New Roman" w:eastAsia="Times New Roman" w:hAnsi="Times New Roman" w:cs="Times New Roman"/>
+          <w:sz w:val="24"/>
+          <w:szCs w:val="24"/>
+        </w:rPr>
+        <w:t xml:space="preserve">score of </w:t>
+      </w:r>
+      <w:r>
+        <w:rPr>
+          <w:rFonts w:ascii="Times New Roman" w:eastAsia="Times New Roman" w:hAnsi="Times New Roman" w:cs="Times New Roman"/>
+          <w:sz w:val="24"/>
+          <w:szCs w:val="24"/>
+        </w:rPr>
+        <w:t>0</w:t>
+      </w:r>
+      <w:r>
+        <w:rPr>
+          <w:rFonts w:ascii="Times New Roman" w:eastAsia="Times New Roman" w:hAnsi="Times New Roman" w:cs="Times New Roman"/>
+          <w:sz w:val="24"/>
+          <w:szCs w:val="24"/>
+        </w:rPr>
+        <w:t xml:space="preserve"> (Low), 1 (Medium) or </w:t>
+      </w:r>
+      <w:r>
+        <w:rPr>
+          <w:rFonts w:ascii="Times New Roman" w:eastAsia="Times New Roman" w:hAnsi="Times New Roman" w:cs="Times New Roman"/>
+          <w:sz w:val="24"/>
+          <w:szCs w:val="24"/>
+        </w:rPr>
+        <w:t>2</w:t>
+      </w:r>
+      <w:r>
+        <w:rPr>
+          <w:rFonts w:ascii="Times New Roman" w:eastAsia="Times New Roman" w:hAnsi="Times New Roman" w:cs="Times New Roman"/>
+          <w:sz w:val="24"/>
+          <w:szCs w:val="24"/>
+        </w:rPr>
+        <w:t xml:space="preserve"> (High)</w:t>
+      </w:r>
+      <w:r>
+        <w:rPr>
+          <w:rFonts w:ascii="Times New Roman" w:eastAsia="Times New Roman" w:hAnsi="Times New Roman" w:cs="Times New Roman"/>
+          <w:sz w:val="24"/>
+          <w:szCs w:val="24"/>
+        </w:rPr>
+        <w:t xml:space="preserve"> </w:t>
+      </w:r>
+      <w:r>
+        <w:rPr>
+          <w:rFonts w:ascii="Times New Roman" w:eastAsia="Times New Roman" w:hAnsi="Times New Roman" w:cs="Times New Roman"/>
+          <w:sz w:val="24"/>
+          <w:szCs w:val="24"/>
+        </w:rPr>
+        <w:t xml:space="preserve">which we use to determine </w:t>
+      </w:r>
+      <w:r>
+        <w:rPr>
+          <w:rFonts w:ascii="Times New Roman" w:eastAsia="Times New Roman" w:hAnsi="Times New Roman" w:cs="Times New Roman"/>
+          <w:sz w:val="24"/>
+          <w:szCs w:val="24"/>
+        </w:rPr>
+        <w:t>R</w:t>
+      </w:r>
+      <w:r>
+        <w:rPr>
+          <w:rFonts w:ascii="Times New Roman" w:eastAsia="Times New Roman" w:hAnsi="Times New Roman" w:cs="Times New Roman"/>
+          <w:sz w:val="24"/>
+          <w:szCs w:val="24"/>
+        </w:rPr>
+        <w:t xml:space="preserve">oad </w:t>
+      </w:r>
+      <w:r>
+        <w:rPr>
+          <w:rFonts w:ascii="Times New Roman" w:eastAsia="Times New Roman" w:hAnsi="Times New Roman" w:cs="Times New Roman"/>
+          <w:sz w:val="24"/>
+          <w:szCs w:val="24"/>
+        </w:rPr>
+        <w:t>Q</w:t>
+      </w:r>
+      <w:r>
+        <w:rPr>
+          <w:rFonts w:ascii="Times New Roman" w:eastAsia="Times New Roman" w:hAnsi="Times New Roman" w:cs="Times New Roman"/>
+          <w:sz w:val="24"/>
+          <w:szCs w:val="24"/>
+        </w:rPr>
+        <w:t>uality</w:t>
+      </w:r>
+      <w:r>
+        <w:rPr>
+          <w:rFonts w:ascii="Times New Roman" w:eastAsia="Times New Roman" w:hAnsi="Times New Roman" w:cs="Times New Roman"/>
+          <w:sz w:val="24"/>
+          <w:szCs w:val="24"/>
+        </w:rPr>
+        <w:t xml:space="preserve"> Rating (RQR)</w:t>
       </w:r>
       <w:r>
         <w:rPr>
@@ -1021,6 +1299,38 @@
           <w:szCs w:val="24"/>
         </w:rPr>
         <w:t>. This helps us analyze the quality of roads before and after the tax cuts</w:t>
+      </w:r>
+      <w:r>
+        <w:rPr>
+          <w:rFonts w:ascii="Times New Roman" w:eastAsia="Times New Roman" w:hAnsi="Times New Roman" w:cs="Times New Roman"/>
+          <w:sz w:val="24"/>
+          <w:szCs w:val="24"/>
+        </w:rPr>
+        <w:t xml:space="preserve">. We </w:t>
+      </w:r>
+      <w:r>
+        <w:rPr>
+          <w:rFonts w:ascii="Times New Roman" w:eastAsia="Times New Roman" w:hAnsi="Times New Roman" w:cs="Times New Roman"/>
+          <w:sz w:val="24"/>
+          <w:szCs w:val="24"/>
+        </w:rPr>
+        <w:t xml:space="preserve">also convert RQR to </w:t>
+      </w:r>
+      <w:r>
+        <w:rPr>
+          <w:rFonts w:ascii="Times New Roman" w:eastAsia="Times New Roman" w:hAnsi="Times New Roman" w:cs="Times New Roman"/>
+          <w:sz w:val="24"/>
+          <w:szCs w:val="24"/>
+        </w:rPr>
+        <w:t>compute a continuous measure from 1-100 called Road Quality Score (RQS)</w:t>
+      </w:r>
+      <w:r>
+        <w:rPr>
+          <w:rFonts w:ascii="Times New Roman" w:eastAsia="Times New Roman" w:hAnsi="Times New Roman" w:cs="Times New Roman"/>
+          <w:sz w:val="24"/>
+          <w:szCs w:val="24"/>
+        </w:rPr>
+        <w:t>.</w:t>
       </w:r>
     </w:p>
     <w:p>
@@ -1035,6 +1345,76 @@
       <w:r>
         <w:rPr>
           <w:rFonts w:ascii="Times New Roman" w:eastAsia="Times New Roman" w:hAnsi="Times New Roman" w:cs="Times New Roman"/>
+          <w:sz w:val="24"/>
+          <w:szCs w:val="24"/>
+        </w:rPr>
+        <w:t xml:space="preserve">We also </w:t>
+      </w:r>
+      <w:r>
+        <w:rPr>
+          <w:rFonts w:ascii="Times New Roman" w:eastAsia="Times New Roman" w:hAnsi="Times New Roman" w:cs="Times New Roman"/>
+          <w:sz w:val="24"/>
+          <w:szCs w:val="24"/>
+        </w:rPr>
+        <w:t xml:space="preserve">specify how our measure of road quality differs from other metrics such as Road Roughness Index (RRI) by Currier, </w:t>
+      </w:r>
+      <w:proofErr w:type="spellStart"/>
+      <w:r>
+        <w:rPr>
+          <w:rFonts w:ascii="Times New Roman" w:eastAsia="Times New Roman" w:hAnsi="Times New Roman" w:cs="Times New Roman"/>
+          <w:sz w:val="24"/>
+          <w:szCs w:val="24"/>
+        </w:rPr>
+        <w:t>Glaeser</w:t>
+      </w:r>
+      <w:proofErr w:type="spellEnd"/>
+      <w:r>
+        <w:rPr>
+          <w:rFonts w:ascii="Times New Roman" w:eastAsia="Times New Roman" w:hAnsi="Times New Roman" w:cs="Times New Roman"/>
+          <w:sz w:val="24"/>
+          <w:szCs w:val="24"/>
+        </w:rPr>
+        <w:t xml:space="preserve"> and </w:t>
+      </w:r>
+      <w:proofErr w:type="spellStart"/>
+      <w:r>
+        <w:rPr>
+          <w:rFonts w:ascii="Times New Roman" w:eastAsia="Times New Roman" w:hAnsi="Times New Roman" w:cs="Times New Roman"/>
+          <w:sz w:val="24"/>
+          <w:szCs w:val="24"/>
+        </w:rPr>
+        <w:t>Kreindler</w:t>
+      </w:r>
+      <w:proofErr w:type="spellEnd"/>
+      <w:r>
+        <w:rPr>
+          <w:rFonts w:ascii="Times New Roman" w:eastAsia="Times New Roman" w:hAnsi="Times New Roman" w:cs="Times New Roman"/>
+          <w:sz w:val="24"/>
+          <w:szCs w:val="24"/>
+        </w:rPr>
+        <w:t xml:space="preserve"> </w:t>
+      </w:r>
+      <w:r>
+        <w:rPr>
+          <w:rFonts w:ascii="Times New Roman" w:eastAsia="Times New Roman" w:hAnsi="Times New Roman" w:cs="Times New Roman"/>
+          <w:sz w:val="24"/>
+          <w:szCs w:val="24"/>
+        </w:rPr>
+        <w:t>(2023), International Roughness Index (IRI) and Pavement Condition Rating (PCR) by Ohio Department of Transportation (ODOT).</w:t>
+      </w:r>
+    </w:p>
+    <w:p>
+      <w:pPr>
+        <w:spacing w:before="100" w:beforeAutospacing="1" w:after="100" w:afterAutospacing="1" w:line="240" w:lineRule="auto"/>
+        <w:rPr>
+          <w:rFonts w:ascii="Times New Roman" w:eastAsia="Times New Roman" w:hAnsi="Times New Roman" w:cs="Times New Roman"/>
+          <w:sz w:val="24"/>
+          <w:szCs w:val="24"/>
+        </w:rPr>
+      </w:pPr>
+      <w:r>
+        <w:rPr>
+          <w:rFonts w:ascii="Times New Roman" w:eastAsia="Times New Roman" w:hAnsi="Times New Roman" w:cs="Times New Roman"/>
           <w:b/>
           <w:bCs/>
           <w:sz w:val="24"/>
@@ -1082,7 +1462,16 @@
           <w:sz w:val="24"/>
           <w:szCs w:val="24"/>
         </w:rPr>
-        <w:t>. Renewal levies expire automatically after a fixed term, independent of local conditions. Cities holding narrowly decided referend</w:t>
+        <w:t xml:space="preserve">. Renewal levies expire automatically </w:t>
+      </w:r>
+      <w:r>
+        <w:rPr>
+          <w:rFonts w:ascii="Times New Roman" w:eastAsia="Times New Roman" w:hAnsi="Times New Roman" w:cs="Times New Roman"/>
+          <w:sz w:val="24"/>
+          <w:szCs w:val="24"/>
+        </w:rPr>
+        <w:lastRenderedPageBreak/>
+        <w:t>after a fixed term, independent of local conditions. Cities holding narrowly decided referend</w:t>
       </w:r>
       <w:r>
         <w:rPr>
@@ -1210,24 +1599,34 @@
           <w:sz w:val="24"/>
           <w:szCs w:val="24"/>
         </w:rPr>
-        <w:t xml:space="preserve"> for narrowly decided elections</w:t>
-      </w:r>
-      <w:r>
-        <w:rPr>
-          <w:rFonts w:ascii="Times New Roman" w:eastAsia="Times New Roman" w:hAnsi="Times New Roman" w:cs="Times New Roman"/>
-          <w:sz w:val="24"/>
-          <w:szCs w:val="24"/>
-        </w:rPr>
-        <w:t xml:space="preserve">. The primary outcomes are a satellite-imagery-based </w:t>
-      </w:r>
-      <w:r>
-        <w:rPr>
-          <w:rFonts w:ascii="Times New Roman" w:eastAsia="Times New Roman" w:hAnsi="Times New Roman" w:cs="Times New Roman"/>
-          <w:sz w:val="24"/>
-          <w:szCs w:val="24"/>
-        </w:rPr>
-        <w:lastRenderedPageBreak/>
-        <w:t>measure of road quality and the median sale price of single-family homes. Estimates are based on local polynomial regressions with bias correction and optimal bandwidth selection. City-level covariates are included for precision but are not necessary for identification.</w:t>
+        <w:t xml:space="preserve"> for </w:t>
+      </w:r>
+      <w:r>
+        <w:rPr>
+          <w:rFonts w:ascii="Times New Roman" w:eastAsia="Times New Roman" w:hAnsi="Times New Roman" w:cs="Times New Roman"/>
+          <w:b/>
+          <w:bCs/>
+          <w:sz w:val="24"/>
+          <w:szCs w:val="24"/>
+          <w:u w:val="single"/>
+        </w:rPr>
+        <w:t>narrowly decided</w:t>
+      </w:r>
+      <w:r>
+        <w:rPr>
+          <w:rFonts w:ascii="Times New Roman" w:eastAsia="Times New Roman" w:hAnsi="Times New Roman" w:cs="Times New Roman"/>
+          <w:sz w:val="24"/>
+          <w:szCs w:val="24"/>
+        </w:rPr>
+        <w:t xml:space="preserve"> elections</w:t>
+      </w:r>
+      <w:r>
+        <w:rPr>
+          <w:rFonts w:ascii="Times New Roman" w:eastAsia="Times New Roman" w:hAnsi="Times New Roman" w:cs="Times New Roman"/>
+          <w:sz w:val="24"/>
+          <w:szCs w:val="24"/>
+        </w:rPr>
+        <w:t>. The primary outcomes are a satellite-imagery-based measure of road quality and the median sale price of single-family homes. Estimates are based on local polynomial regressions with bias correction and optimal bandwidth selection. City-level covariates are included for precision but are not necessary for identification.</w:t>
       </w:r>
       <w:r>
         <w:rPr>
@@ -1425,7 +1824,15 @@
           <w:sz w:val="24"/>
           <w:szCs w:val="24"/>
         </w:rPr>
-        <w:t>detects a 0.44</w:t>
+        <w:t xml:space="preserve">detects a </w:t>
+      </w:r>
+      <w:r>
+        <w:rPr>
+          <w:rFonts w:ascii="Times New Roman" w:eastAsia="Times New Roman" w:hAnsi="Times New Roman" w:cs="Times New Roman"/>
+          <w:sz w:val="24"/>
+          <w:szCs w:val="24"/>
+        </w:rPr>
+        <w:t>14</w:t>
       </w:r>
       <w:r>
         <w:rPr>
@@ -1434,7 +1841,47 @@
           <w:szCs w:val="24"/>
         </w:rPr>
         <w:noBreakHyphen/>
-        <w:t>point (15 %) decline in road quality only in jurisdictions that lost the levy, consistent with the time needed for pavements to visibly crumble.</w:t>
+        <w:t>point (</w:t>
+      </w:r>
+      <w:r>
+        <w:rPr>
+          <w:rFonts w:ascii="Times New Roman" w:eastAsia="Times New Roman" w:hAnsi="Times New Roman" w:cs="Times New Roman"/>
+          <w:sz w:val="24"/>
+          <w:szCs w:val="24"/>
+        </w:rPr>
+        <w:t>23</w:t>
+      </w:r>
+      <w:r>
+        <w:rPr>
+          <w:rFonts w:ascii="Times New Roman" w:eastAsia="Times New Roman" w:hAnsi="Times New Roman" w:cs="Times New Roman"/>
+          <w:sz w:val="24"/>
+          <w:szCs w:val="24"/>
+        </w:rPr>
+        <w:t xml:space="preserve"> %) decline in </w:t>
+      </w:r>
+      <w:r>
+        <w:rPr>
+          <w:rFonts w:ascii="Times New Roman" w:eastAsia="Times New Roman" w:hAnsi="Times New Roman" w:cs="Times New Roman"/>
+          <w:sz w:val="24"/>
+          <w:szCs w:val="24"/>
+        </w:rPr>
+        <w:t>Road Quality Score (</w:t>
+      </w:r>
+      <w:r>
+        <w:rPr>
+          <w:rFonts w:ascii="Times New Roman" w:eastAsia="Times New Roman" w:hAnsi="Times New Roman" w:cs="Times New Roman"/>
+          <w:sz w:val="24"/>
+          <w:szCs w:val="24"/>
+        </w:rPr>
+        <w:t>RQS) and a 0.44-point (32%) decline in Road Quality Rating (RQR)</w:t>
+      </w:r>
+      <w:r>
+        <w:rPr>
+          <w:rFonts w:ascii="Times New Roman" w:eastAsia="Times New Roman" w:hAnsi="Times New Roman" w:cs="Times New Roman"/>
+          <w:sz w:val="24"/>
+          <w:szCs w:val="24"/>
+        </w:rPr>
+        <w:t xml:space="preserve"> only in jurisdictions that lost the levy, consistent with the time needed for pavements to visibly crumble.</w:t>
       </w:r>
     </w:p>
     <w:p>
@@ -1665,7 +2112,23 @@
           <w:sz w:val="24"/>
           <w:szCs w:val="24"/>
         </w:rPr>
-        <w:t>market outcomes; (ii) demonstrates that abandoning routine maintenance erodes asset values in developed economies (iii) provides a template for using computer vision within quasi</w:t>
+        <w:t xml:space="preserve">market outcomes; (ii) demonstrates that abandoning routine maintenance erodes asset values in developed economies (iii) provides a </w:t>
+      </w:r>
+      <w:r>
+        <w:rPr>
+          <w:rFonts w:ascii="Times New Roman" w:eastAsia="Times New Roman" w:hAnsi="Times New Roman" w:cs="Times New Roman"/>
+          <w:sz w:val="24"/>
+          <w:szCs w:val="24"/>
+        </w:rPr>
+        <w:t xml:space="preserve">novel measure for road quality and a </w:t>
+      </w:r>
+      <w:r>
+        <w:rPr>
+          <w:rFonts w:ascii="Times New Roman" w:eastAsia="Times New Roman" w:hAnsi="Times New Roman" w:cs="Times New Roman"/>
+          <w:sz w:val="24"/>
+          <w:szCs w:val="24"/>
+        </w:rPr>
+        <w:t>template for using computer vision within quasi</w:t>
       </w:r>
       <w:r>
         <w:rPr>
@@ -1703,66 +2166,14 @@
           <w:szCs w:val="24"/>
         </w:rPr>
         <w:br/>
-        <w:t>Short</w:t>
-      </w:r>
-      <w:r>
-        <w:rPr>
-          <w:rFonts w:ascii="Times New Roman" w:eastAsia="Times New Roman" w:hAnsi="Times New Roman" w:cs="Times New Roman"/>
-          <w:sz w:val="24"/>
-          <w:szCs w:val="24"/>
-        </w:rPr>
-        <w:noBreakHyphen/>
-        <w:t>run tax relief is eclipsed by longer</w:t>
-      </w:r>
-      <w:r>
-        <w:rPr>
-          <w:rFonts w:ascii="Times New Roman" w:eastAsia="Times New Roman" w:hAnsi="Times New Roman" w:cs="Times New Roman"/>
-          <w:sz w:val="24"/>
-          <w:szCs w:val="24"/>
-        </w:rPr>
-        <w:noBreakHyphen/>
-        <w:t>run private losses. Deferred maintenance thus resembles an unfunded liability, imposing stealth costs on homeowners and local tax bases. Policymakers considering levy roll</w:t>
-      </w:r>
-      <w:r>
-        <w:rPr>
-          <w:rFonts w:ascii="Times New Roman" w:eastAsia="Times New Roman" w:hAnsi="Times New Roman" w:cs="Times New Roman"/>
-          <w:sz w:val="24"/>
-          <w:szCs w:val="24"/>
-        </w:rPr>
-        <w:noBreakHyphen/>
-        <w:t>backs</w:t>
-      </w:r>
-      <w:r>
-        <w:rPr>
-          <w:rFonts w:ascii="Times New Roman" w:eastAsia="Times New Roman" w:hAnsi="Times New Roman" w:cs="Times New Roman"/>
-          <w:sz w:val="24"/>
-          <w:szCs w:val="24"/>
-        </w:rPr>
-        <w:t xml:space="preserve"> designed to fund infrastructure maintenance </w:t>
-      </w:r>
-      <w:r>
-        <w:rPr>
-          <w:rFonts w:ascii="Times New Roman" w:eastAsia="Times New Roman" w:hAnsi="Times New Roman" w:cs="Times New Roman"/>
-          <w:sz w:val="24"/>
-          <w:szCs w:val="24"/>
-        </w:rPr>
-        <w:t>should weigh these hidden capital losses against temporary savings</w:t>
-      </w:r>
-      <w:r>
-        <w:rPr>
-          <w:rFonts w:ascii="Times New Roman" w:eastAsia="Times New Roman" w:hAnsi="Times New Roman" w:cs="Times New Roman"/>
-          <w:sz w:val="24"/>
-          <w:szCs w:val="24"/>
-        </w:rPr>
-        <w:t xml:space="preserve"> for households</w:t>
-      </w:r>
-      <w:r>
-        <w:rPr>
-          <w:rFonts w:ascii="Times New Roman" w:eastAsia="Times New Roman" w:hAnsi="Times New Roman" w:cs="Times New Roman"/>
-          <w:sz w:val="24"/>
-          <w:szCs w:val="24"/>
-        </w:rPr>
-        <w:t>.</w:t>
+      </w:r>
+      <w:r>
+        <w:rPr>
+          <w:rFonts w:ascii="Times New Roman" w:eastAsia="Times New Roman" w:hAnsi="Times New Roman" w:cs="Times New Roman"/>
+          <w:sz w:val="24"/>
+          <w:szCs w:val="24"/>
+        </w:rPr>
+        <w:t>Short run tax relief is eclipsed by long-term private losses. In the short-run, residents may experience immediate relief in property tax payments, but these short-term benefits eventually give way to negative long-term consequences as deteriorating road conditions lead to significant reductions in house values. These insights provide policymakers in advanced economies with crucial evidence to better evaluate the trade-offs associated with local taxation decisions impacting infrastructure.</w:t>
       </w:r>
     </w:p>
     <w:p>
@@ -1786,15 +2197,8 @@
         </w:numPr>
       </w:pPr>
       <w:r>
-        <w:t>Brewer, Ethan, et al. "</w:t>
-      </w:r>
-      <w:proofErr w:type="gramStart"/>
-      <w:r>
-        <w:t>Predicting road</w:t>
-      </w:r>
-      <w:proofErr w:type="gramEnd"/>
-      <w:r>
-        <w:t xml:space="preserve"> quality using high resolution satellite imagery: A transfer learning approach." </w:t>
+        <w:lastRenderedPageBreak/>
+        <w:t>Brewer, Ethan, et al. "Predicting road quality using high resolution satellite imagery: A transfer learning approach." </w:t>
       </w:r>
       <w:proofErr w:type="spellStart"/>
       <w:r>
@@ -1847,6 +2251,48 @@
       </w:r>
       <w:r>
         <w:t> 125.1 (2010): 215-261.</w:t>
+      </w:r>
+    </w:p>
+    <w:p>
+      <w:pPr>
+        <w:pStyle w:val="ListParagraph"/>
+      </w:pPr>
+    </w:p>
+    <w:p>
+      <w:pPr>
+        <w:pStyle w:val="ListParagraph"/>
+        <w:numPr>
+          <w:ilvl w:val="0"/>
+          <w:numId w:val="3"/>
+        </w:numPr>
+      </w:pPr>
+      <w:r>
+        <w:t xml:space="preserve">Currier, Lindsey, Edward L. </w:t>
+      </w:r>
+      <w:proofErr w:type="spellStart"/>
+      <w:r>
+        <w:t>Glaeser</w:t>
+      </w:r>
+      <w:proofErr w:type="spellEnd"/>
+      <w:r>
+        <w:t xml:space="preserve">, and Gabriel E. </w:t>
+      </w:r>
+      <w:proofErr w:type="spellStart"/>
+      <w:r>
+        <w:t>Kreindler</w:t>
+      </w:r>
+      <w:proofErr w:type="spellEnd"/>
+      <w:r>
+        <w:t xml:space="preserve">. "Infrastructure Inequality: Who Pays the Cost of Road Roughness?" </w:t>
+      </w:r>
+      <w:r>
+        <w:rPr>
+          <w:rStyle w:val="Emphasis"/>
+        </w:rPr>
+        <w:t>National Bureau of Economic Research</w:t>
+      </w:r>
+      <w:r>
+        <w:t xml:space="preserve"> (2023).</w:t>
       </w:r>
     </w:p>
     <w:sectPr>
@@ -2590,6 +3036,7 @@
   <w:style w:type="character" w:default="1" w:styleId="DefaultParagraphFont">
     <w:name w:val="Default Paragraph Font"/>
     <w:uiPriority w:val="1"/>
+    <w:semiHidden/>
     <w:unhideWhenUsed/>
   </w:style>
   <w:style w:type="table" w:default="1" w:styleId="TableNormal">

</xml_diff>